<commit_message>
Sprostowanie notatki walidacyjnej: brak projektu rozporządzenia z 2025 r., nowelizacje art. 54 PE z 2026 r.
Co-Authored-By: Claude Fable 5.1 <noreply@anthropic.com>
Claude-Session: https://claude.ai/code/session_011F5uixAyuRKgAnCYGuuc2U
</commit_message>
<xml_diff>
--- a/04_Walidacja_prawna_pisma_2026-10-29.docx
+++ b/04_Walidacja_prawna_pisma_2026-10-29.docx
@@ -295,7 +295,23 @@
         </w:rPr>
         <w:t>9.</w:t>
         <w:tab/>
-        <w:t>§ 13 ust. 1 rozporządzenia MKiŚ z 1.07.2022 r. (Dz.U. poz. 1392) – termin 14 dni na wydanie świadectwa (podstawa wewnętrzna, nie powołana w piśmie). Rozporządzenie według ELI obowiązuje, nie odnaleziono aktu zmieniającego ani uchylającego. Termin 14 dni od egzaminu potwierdzony pośrednio (powielają go regulaminy komisji kwalifikacyjnych SEP). Numer paragrafu do potwierdzenia w tekście Dz.U. Istotne: w 2025 r. istniał projekt nowego rozporządzenia w tej samej sprawie (wejście w życie 30 dni od ogłoszenia). Należy potwierdzić w RCL, które rozporządzenie obowiązywało 17.09.2026 r., bo od tego zależy treść zarzutu wobec komisji i ocena URE.</w:t>
+        <w:t>§ 13 ust. 1 rozporządzenia MKiŚ z 1.07.2022 r. (Dz.U. poz. 1392) – termin 14 dni na wydanie świadectwa (podstawa wewnętrzna, nie powołana w piśmie). Rozporządzenie według ELI obowiązuje, nie odnaleziono aktu zmieniającego ani uchylającego. Termin 14 dni od egzaminu potwierdzony pośrednio (powielają go regulaminy komisji kwalifikacyjnych SEP). Numer paragrafu do potwierdzenia w tekście Dz.U. Sprostowanie: w pierwotnej wersji tej notatki wskazano na „projekt nowego rozporządzenia z 2025 r.”; po ponownej weryfikacji nie odnaleziono takiego projektu. Jedyny odnaleziony projekt to projekt z początku 2022 r. (konsultacje publiczne luty 2022 r., „Tydzień w SEP” nr 326), który został uchwalony jako rozporządzenie z 1.07.2022 r.; wykazy prac legislacyjnych MKiŚ z 27.05.2025 r. i 31.07.2025 r. nie zawierają pozycji dotyczącej tego rozporządzenia. Przyjąć, że 17.09.2026 r. obowiązywało rozporządzenie z 1.07.2022 r. w brzmieniu pierwotnym; ostateczne potwierdzenie braku zmian – w ISAP/LEX.</w:t>
+      </w:r>
+    </w:p>
+    <w:p>
+      <w:pPr>
+        <w:ind w:left="425" w:hanging="425"/>
+        <w:jc w:val="both"/>
+      </w:pPr>
+      <w:r>
+        <w:rPr>
+          <w:rFonts w:ascii="Calibri" w:hAnsi="Calibri"/>
+          <w:b w:val="0"/>
+          <w:sz w:val="24"/>
+        </w:rPr>
+        <w:t>14.</w:t>
+        <w:tab/>
+        <w:t>Art. 54 Prawa energetycznego – zmiany w 2026 r. Tekst jednolity: Dz.U. 2026 poz. 43. Ustawa z 13.03.2026 r. o zmianie ustawy – Prawo energetyczne oraz niektórych innych ustaw (Dz.U. 2026 poz. 516, w życie 30.04.2026 r.) oraz ustawa z 11.06.2026 r. o zmianie niektórych ustaw w celu dokonania deregulacji w zakresie energetyki (Dz.U. 2026 poz. 900, w życie 21.07.2026 r.). Jedyna zidentyfikowana zmiana art. 54 to dodany ust. 4b (zwolnienie z opłaty za sprawdzenie kwalifikacji przez komisje powołane przez Ministra Sprawiedliwości) – bez znaczenia dla sprawy. Nie odnaleziono zmiany ust. 3 (komisje przy stowarzyszeniach naukowo-technicznych) ani ust. 4 (opłata). Wzmianka o kolejnym akcie zmieniającym (Dz.U. 2026 poz. 1281) niepotwierdzona. Do sprawdzenia w LEX przy okazji sporu KK 739 / SOKiK: aktualne brzmienie art. 54 ust. 3 i 3a oraz przepisów przejściowych obu ustaw.</w:t>
       </w:r>
     </w:p>
     <w:p>
@@ -400,6 +416,22 @@
           <w:sz w:val="24"/>
         </w:rPr>
         <w:t>2.</w:t>
+        <w:tab/>
+        <w:t>Wysokie (zmienione). Pierwotnie wskazano tu potrzebę ustalenia, czy 17.09.2026 r. obowiązywało rozporządzenie z 2022 r., czy nowy akt z projektu z 2025 r. Projekt z 2025 r. nie istnieje (sekcja III pkt 9). Pozycja pozostaje jako polecenie potwierdzenia w ISAP/LEX, że rozporządzenie Dz.U. 2022 poz. 1392 nie było zmieniane, oraz sprawdzenia aktualnego brzmienia art. 54 ust. 3–4 Prawa energetycznego po nowelizacjach z 2026 r. (sekcja III pkt 14).</w:t>
+      </w:r>
+    </w:p>
+    <w:p>
+      <w:pPr>
+        <w:ind w:left="425" w:hanging="425"/>
+        <w:jc w:val="both"/>
+      </w:pPr>
+      <w:r>
+        <w:rPr>
+          <w:rFonts w:ascii="Calibri" w:hAnsi="Calibri"/>
+          <w:b w:val="0"/>
+          <w:sz w:val="24"/>
+        </w:rPr>
+        <w:t>9.</w:t>
         <w:tab/>
         <w:t>Wysokie. Świadectwo z dozoru nadal nie zostało wysłane (pkt 4.4 kontekstu). Każdy dzień wydłuża okres ewentualnej szkody i osłabia argument, że skutki opóźnienia zakończyły się 19.10.2026 r. Wysłać niezwłocznie, kurierem z potwierdzeniem odbioru, na adres z wniosku.</w:t>
       </w:r>
@@ -685,6 +717,110 @@
           <w:sz w:val="24"/>
         </w:rPr>
         <w:t>Świadectwo kwalifikacji – biznes.gov.pl: https://www.biznes.gov.pl/pl/portal/ou142</w:t>
+      </w:r>
+    </w:p>
+    <w:p>
+      <w:pPr>
+        <w:ind w:left="425" w:hanging="425"/>
+      </w:pPr>
+      <w:r>
+        <w:rPr>
+          <w:rFonts w:ascii="Calibri" w:hAnsi="Calibri"/>
+          <w:b w:val="0"/>
+          <w:sz w:val="24"/>
+        </w:rPr>
+        <w:t>Projekt rozporządzenia (2022) – Tydzień w SEP nr 326: https://sep.com.pl/tydzien-w-sep/326/projekt-rozporzadzenia-ministra-klimatu-i-srodowiska-w-sprawie-szczegolowych-zasad-stwierdzenia-posiadania-kwalifikacji-przez-osoby-zajmujace-sie-eksploatacja-urzadzen-instalacji-i-sieci.html</w:t>
+      </w:r>
+    </w:p>
+    <w:p>
+      <w:pPr>
+        <w:ind w:left="425" w:hanging="425"/>
+      </w:pPr>
+      <w:r>
+        <w:rPr>
+          <w:rFonts w:ascii="Calibri" w:hAnsi="Calibri"/>
+          <w:b w:val="0"/>
+          <w:sz w:val="24"/>
+        </w:rPr>
+        <w:t>Projekt rozporządzenia (2022) – załączniki, konsultacje ZPP (luty 2022): https://www.zpp.pl/storage/library/2022-02/930ffd0002adc9b5d48fb65db67ff1ef.pdf</w:t>
+      </w:r>
+    </w:p>
+    <w:p>
+      <w:pPr>
+        <w:ind w:left="425" w:hanging="425"/>
+      </w:pPr>
+      <w:r>
+        <w:rPr>
+          <w:rFonts w:ascii="Calibri" w:hAnsi="Calibri"/>
+          <w:b w:val="0"/>
+          <w:sz w:val="24"/>
+        </w:rPr>
+        <w:t>Wykaz prac legislacyjnych MKiŚ z 27.05.2025 r.: https://bip.mos.gov.pl/fileadmin/user_upload/bip/prawo/wykaz_prac_legislacyjnych/2025.05.27_Wykaz_prac_legislacyjnych_Ministra_Klimatu_i_Srodowiska.pdf</w:t>
+      </w:r>
+    </w:p>
+    <w:p>
+      <w:pPr>
+        <w:ind w:left="425" w:hanging="425"/>
+      </w:pPr>
+      <w:r>
+        <w:rPr>
+          <w:rFonts w:ascii="Calibri" w:hAnsi="Calibri"/>
+          <w:b w:val="0"/>
+          <w:sz w:val="24"/>
+        </w:rPr>
+        <w:t>Wykaz prac legislacyjnych MKiŚ z 31.07.2025 r.: https://bip.mos.gov.pl/fileadmin/user_upload/bip/prawo/wykaz_prac_legislacyjnych/2025.07.31_Wykaz_prac_legislacyjnych_Ministra_Klimatu_i_Srodowiska.pdf</w:t>
+      </w:r>
+    </w:p>
+    <w:p>
+      <w:pPr>
+        <w:ind w:left="425" w:hanging="425"/>
+      </w:pPr>
+      <w:r>
+        <w:rPr>
+          <w:rFonts w:ascii="Calibri" w:hAnsi="Calibri"/>
+          <w:b w:val="0"/>
+          <w:sz w:val="24"/>
+        </w:rPr>
+        <w:t>Ustawa z 13.03.2026 r., Dz.U. 2026 poz. 516 – ISAP: https://isap.sejm.gov.pl/isap.nsf/download.xsp/WDU20260000516/O/D20260516.pdf</w:t>
+      </w:r>
+    </w:p>
+    <w:p>
+      <w:pPr>
+        <w:ind w:left="425" w:hanging="425"/>
+      </w:pPr>
+      <w:r>
+        <w:rPr>
+          <w:rFonts w:ascii="Calibri" w:hAnsi="Calibri"/>
+          <w:b w:val="0"/>
+          <w:sz w:val="24"/>
+        </w:rPr>
+        <w:t>Ustawa z 11.06.2026 r., Dz.U. 2026 poz. 900 – infor.pl (metryka): https://www.infor.pl/akt-prawny/DZU.2026.187.0000900,metryka,ustawa-o-zmianie-niektorych-ustaw-w-celu-dokonania-deregulacji-w-zakresie-energetyki.html</w:t>
+      </w:r>
+    </w:p>
+    <w:p>
+      <w:pPr>
+        <w:ind w:left="425" w:hanging="425"/>
+      </w:pPr>
+      <w:r>
+        <w:rPr>
+          <w:rFonts w:ascii="Calibri" w:hAnsi="Calibri"/>
+          <w:b w:val="0"/>
+          <w:sz w:val="24"/>
+        </w:rPr>
+        <w:t>Przegląd zmian Prawa energetycznego (stan 29.09.2026): https://prawo.kalinski-energia.pl/</w:t>
+      </w:r>
+    </w:p>
+    <w:p>
+      <w:pPr>
+        <w:ind w:left="425" w:hanging="425"/>
+      </w:pPr>
+      <w:r>
+        <w:rPr>
+          <w:rFonts w:ascii="Calibri" w:hAnsi="Calibri"/>
+          <w:b w:val="0"/>
+          <w:sz w:val="24"/>
+        </w:rPr>
+        <w:t>Komisje kwalifikacyjne – URE (wykaz czynnych komisji, stan 18.03.2026): https://www.ure.gov.pl/pl/biznes/komisje-kwalifikacyjne</w:t>
       </w:r>
     </w:p>
     <w:p>

</xml_diff>